<commit_message>
Corregir acentos y actualizar nombre del sistema en notebook y módulos
</commit_message>
<xml_diff>
--- a/data/outputs/Reporte_Portafolio_Terra.docx
+++ b/data/outputs/Reporte_Portafolio_Terra.docx
@@ -23,7 +23,7 @@
         <w:rPr>
           <w:b/>
         </w:rPr>
-        <w:t>Reporte Consolidado de Portafolio Verde — Credito Terra</w:t>
+        <w:t>Reporte consolidado de portafolio verde — Crédito Terra</w:t>
       </w:r>
     </w:p>
     <w:p>
@@ -31,7 +31,7 @@
         <w:jc w:val="center"/>
       </w:pPr>
       <w:r>
-        <w:t>Generado: 26/05/2026 18:22</w:t>
+        <w:t>Generado: 26/05/2026 20:32</w:t>
       </w:r>
     </w:p>
     <w:p/>
@@ -51,10 +51,11 @@
         <w:rPr>
           <w:b/>
         </w:rPr>
-        <w:t xml:space="preserve">Total casos evaluados: </w:t>
+        <w:br/>
+        <w:t xml:space="preserve">Total de casos evaluados: </w:t>
       </w:r>
       <w:r>
-        <w:t>201</w:t>
+        <w:t>203</w:t>
       </w:r>
     </w:p>
     <w:p>
@@ -62,10 +63,10 @@
         <w:rPr>
           <w:b/>
         </w:rPr>
-        <w:t xml:space="preserve">Casos CUMPLEN elegibilidad: </w:t>
+        <w:t xml:space="preserve">Casos que CUMPLEN elegibilidad: </w:t>
       </w:r>
       <w:r>
-        <w:t>63 (31.3%)</w:t>
+        <w:t>65 (32.0%)</w:t>
       </w:r>
     </w:p>
     <w:p>
@@ -76,7 +77,7 @@
         <w:t xml:space="preserve">Monto total evaluado: </w:t>
       </w:r>
       <w:r>
-        <w:t>$193,126,168.80</w:t>
+        <w:t>$193,726,168.80</w:t>
       </w:r>
     </w:p>
     <w:p>
@@ -87,7 +88,7 @@
         <w:t xml:space="preserve">GEI evitadas anuales: </w:t>
       </w:r>
       <w:r>
-        <w:t>186,894.77 tCO2/anio</w:t>
+        <w:t>199,691.50 tCO2/año</w:t>
       </w:r>
     </w:p>
     <w:p>
@@ -95,10 +96,10 @@
         <w:rPr>
           <w:b/>
         </w:rPr>
-        <w:t xml:space="preserve">GEI evitadas totales vida util: </w:t>
+        <w:t xml:space="preserve">GEI evitadas totales vida útil: </w:t>
       </w:r>
       <w:r>
-        <w:t>4,545,961.04 tCO2</w:t>
+        <w:t>4,865,879.39 tCO2</w:t>
       </w:r>
     </w:p>
     <w:p>
@@ -126,7 +127,8 @@
     </w:p>
     <w:p>
       <w:r>
-        <w:t>El portafolio Credito Terra de energia fotovoltaica contribuye a: ODS 7 (Energia asequible y no contaminante), ODS 13 (Accion por el clima), ODS 8.4 (Eficiencia en uso de recursos) y ODS 9.4 (Industria sostenible).</w:t>
+        <w:br/>
+        <w:t>El portafolio de Crédito Terra correspondiente a proyectos de energía fotovoltaica contribuye a los siguientes ODS: ODS 7 (Energía asequible y no contaminante), ODS 9 (Industria, innovación e infraestructura), ODS 12 (Producción y consumo responsables) y ODS 13 (Acción por el clima)</w:t>
       </w:r>
     </w:p>
     <w:p/>
@@ -138,7 +140,8 @@
         <w:rPr>
           <w:color w:val="D4007A"/>
         </w:rPr>
-        <w:t>3. Distribucion del Portafolio por Sector</w:t>
+        <w:t>3. Distribución del portafolio por sector</w:t>
+        <w:br/>
       </w:r>
     </w:p>
     <w:tbl>
@@ -188,7 +191,7 @@
               <w:rPr>
                 <w:b/>
               </w:rPr>
-              <w:t>Tasa aprobacion</w:t>
+              <w:t>Tasa de aprobación</w:t>
             </w:r>
           </w:p>
         </w:tc>
@@ -328,6 +331,38 @@
           </w:tcPr>
           <w:p>
             <w:r>
+              <w:t>INDUSTRIA ALIMENTICIA</w:t>
+            </w:r>
+          </w:p>
+        </w:tc>
+        <w:tc>
+          <w:tcPr>
+            <w:tcW w:type="dxa" w:w="3135"/>
+          </w:tcPr>
+          <w:p>
+            <w:r>
+              <w:t>16</w:t>
+            </w:r>
+          </w:p>
+        </w:tc>
+        <w:tc>
+          <w:tcPr>
+            <w:tcW w:type="dxa" w:w="3135"/>
+          </w:tcPr>
+          <w:p>
+            <w:r>
+              <w:t>62.5%</w:t>
+            </w:r>
+          </w:p>
+        </w:tc>
+      </w:tr>
+      <w:tr>
+        <w:tc>
+          <w:tcPr>
+            <w:tcW w:type="dxa" w:w="3135"/>
+          </w:tcPr>
+          <w:p>
+            <w:r>
               <w:t>INDUSTRIA FARMACÉUTICA</w:t>
             </w:r>
           </w:p>
@@ -413,38 +448,6 @@
           <w:p>
             <w:r>
               <w:t>50.0%</w:t>
-            </w:r>
-          </w:p>
-        </w:tc>
-      </w:tr>
-      <w:tr>
-        <w:tc>
-          <w:tcPr>
-            <w:tcW w:type="dxa" w:w="3135"/>
-          </w:tcPr>
-          <w:p>
-            <w:r>
-              <w:t>INDUSTRIA ALIMENTICIA</w:t>
-            </w:r>
-          </w:p>
-        </w:tc>
-        <w:tc>
-          <w:tcPr>
-            <w:tcW w:type="dxa" w:w="3135"/>
-          </w:tcPr>
-          <w:p>
-            <w:r>
-              <w:t>14</w:t>
-            </w:r>
-          </w:p>
-        </w:tc>
-        <w:tc>
-          <w:tcPr>
-            <w:tcW w:type="dxa" w:w="3135"/>
-          </w:tcPr>
-          <w:p>
-            <w:r>
-              <w:t>57.1%</w:t>
             </w:r>
           </w:p>
         </w:tc>
@@ -683,12 +686,13 @@
         <w:rPr>
           <w:color w:val="D4007A"/>
         </w:rPr>
-        <w:t>4. Modelo Predictivo — Nota Metodologica</w:t>
+        <w:t>4. Modelo Predictivo — Nota metodológica</w:t>
       </w:r>
     </w:p>
     <w:p>
       <w:r>
-        <w:t>El sistema incluye un modelo Random Forest para estimacion preliminar de elegibilidad. Conforme a Riley et al. (2019), el primer entrenamiento con datos reales requiere minimo 200 casos evaluados. Re-entrenamiento cada 150 casos nuevos o precision &lt; 80%, con validacion del area de sostenibilidad. Precision actual (datos simulados): N/D% | AUC-ROC: N/D.</w:t>
+        <w:br/>
+        <w:t>El sistema incluye un modelo Random Forest para estimación preliminar de elegibilidad. Conforme a Riley et al. (2019), el primer entrenamiento con datos reales requiere mínimo 200 casos evaluados. Re-entrenamiento cada 150 casos nuevos o precisión &lt; 80%, con validación del area de sostenibilidad. Precision actual (datos simulados): N/D% | AUC-ROC: N/D.</w:t>
       </w:r>
     </w:p>
     <w:sectPr>

</xml_diff>

<commit_message>
fix: filtrar 200 casos simulados en análisis de portafolio y ML
</commit_message>
<xml_diff>
--- a/data/outputs/Reporte_Portafolio_Terra.docx
+++ b/data/outputs/Reporte_Portafolio_Terra.docx
@@ -31,7 +31,7 @@
         <w:jc w:val="center"/>
       </w:pPr>
       <w:r>
-        <w:t>Generado: 26/05/2026 21:38</w:t>
+        <w:t>Generado: 01/06/2026 21:27</w:t>
       </w:r>
     </w:p>
     <w:p/>
@@ -351,7 +351,7 @@
           </w:tcPr>
           <w:p>
             <w:r>
-              <w:t>62.5%</w:t>
+              <w:t>53.8%</w:t>
             </w:r>
           </w:p>
         </w:tc>

</xml_diff>

<commit_message>
fix: consistencia terminológica en notebook, src y README
</commit_message>
<xml_diff>
--- a/data/outputs/Reporte_Portafolio_Terra.docx
+++ b/data/outputs/Reporte_Portafolio_Terra.docx
@@ -31,7 +31,7 @@
         <w:jc w:val="center"/>
       </w:pPr>
       <w:r>
-        <w:t>Generado: 01/06/2026 21:27</w:t>
+        <w:t>Generado: 02/06/2026 21:59</w:t>
       </w:r>
     </w:p>
     <w:p/>
@@ -55,7 +55,7 @@
         <w:t xml:space="preserve">Total de casos evaluados: </w:t>
       </w:r>
       <w:r>
-        <w:t>203</w:t>
+        <w:t>200</w:t>
       </w:r>
     </w:p>
     <w:p>
@@ -66,7 +66,7 @@
         <w:t xml:space="preserve">Casos que CUMPLEN elegibilidad: </w:t>
       </w:r>
       <w:r>
-        <w:t>65 (32.0%)</w:t>
+        <w:t>62 (31.0%)</w:t>
       </w:r>
     </w:p>
     <w:p>
@@ -77,7 +77,7 @@
         <w:t xml:space="preserve">Monto total evaluado: </w:t>
       </w:r>
       <w:r>
-        <w:t>$193,726,168.80</w:t>
+        <w:t>$192,826,168.80</w:t>
       </w:r>
     </w:p>
     <w:p>
@@ -85,10 +85,10 @@
         <w:rPr>
           <w:b/>
         </w:rPr>
-        <w:t xml:space="preserve">GEI evitadas anuales: </w:t>
+        <w:t xml:space="preserve">Emisiones de GEI evitadas anuales (elegibles): </w:t>
       </w:r>
       <w:r>
-        <w:t>199,691.50 tCO2/año</w:t>
+        <w:t>55,557.15 tCO2/año</w:t>
       </w:r>
     </w:p>
     <w:p>
@@ -96,10 +96,10 @@
         <w:rPr>
           <w:b/>
         </w:rPr>
-        <w:t xml:space="preserve">GEI evitadas totales vida útil: </w:t>
+        <w:t xml:space="preserve">Emisiones de GEI evitadas totales vida útil (elegibles): </w:t>
       </w:r>
       <w:r>
-        <w:t>4,865,879.39 tCO2</w:t>
+        <w:t>1,363,516.58 tCO2</w:t>
       </w:r>
     </w:p>
     <w:p>
@@ -331,7 +331,7 @@
           </w:tcPr>
           <w:p>
             <w:r>
-              <w:t>INDUSTRIA ALIMENTICIA</w:t>
+              <w:t>SERVICIOS ESENCIALES</w:t>
             </w:r>
           </w:p>
         </w:tc>
@@ -341,7 +341,7 @@
           </w:tcPr>
           <w:p>
             <w:r>
-              <w:t>16</w:t>
+              <w:t>15</w:t>
             </w:r>
           </w:p>
         </w:tc>
@@ -351,7 +351,7 @@
           </w:tcPr>
           <w:p>
             <w:r>
-              <w:t>53.8%</w:t>
+              <w:t>53.3%</w:t>
             </w:r>
           </w:p>
         </w:tc>
@@ -395,38 +395,6 @@
           </w:tcPr>
           <w:p>
             <w:r>
-              <w:t>SERVICIOS ESENCIALES</w:t>
-            </w:r>
-          </w:p>
-        </w:tc>
-        <w:tc>
-          <w:tcPr>
-            <w:tcW w:type="dxa" w:w="3135"/>
-          </w:tcPr>
-          <w:p>
-            <w:r>
-              <w:t>15</w:t>
-            </w:r>
-          </w:p>
-        </w:tc>
-        <w:tc>
-          <w:tcPr>
-            <w:tcW w:type="dxa" w:w="3135"/>
-          </w:tcPr>
-          <w:p>
-            <w:r>
-              <w:t>53.3%</w:t>
-            </w:r>
-          </w:p>
-        </w:tc>
-      </w:tr>
-      <w:tr>
-        <w:tc>
-          <w:tcPr>
-            <w:tcW w:type="dxa" w:w="3135"/>
-          </w:tcPr>
-          <w:p>
-            <w:r>
               <w:t>AGROPECUARIO</w:t>
             </w:r>
           </w:p>
@@ -448,6 +416,38 @@
           <w:p>
             <w:r>
               <w:t>50.0%</w:t>
+            </w:r>
+          </w:p>
+        </w:tc>
+      </w:tr>
+      <w:tr>
+        <w:tc>
+          <w:tcPr>
+            <w:tcW w:type="dxa" w:w="3135"/>
+          </w:tcPr>
+          <w:p>
+            <w:r>
+              <w:t>INDUSTRIA ALIMENTICIA</w:t>
+            </w:r>
+          </w:p>
+        </w:tc>
+        <w:tc>
+          <w:tcPr>
+            <w:tcW w:type="dxa" w:w="3135"/>
+          </w:tcPr>
+          <w:p>
+            <w:r>
+              <w:t>13</w:t>
+            </w:r>
+          </w:p>
+        </w:tc>
+        <w:tc>
+          <w:tcPr>
+            <w:tcW w:type="dxa" w:w="3135"/>
+          </w:tcPr>
+          <w:p>
+            <w:r>
+              <w:t>53.8%</w:t>
             </w:r>
           </w:p>
         </w:tc>
@@ -692,7 +692,7 @@
     <w:p>
       <w:r>
         <w:br/>
-        <w:t>El sistema incluye un modelo Random Forest para estimación preliminar de elegibilidad. Conforme a Riley et al. (2019), el primer entrenamiento con datos reales requiere mínimo 200 casos evaluados. Re-entrenamiento cada 150 casos nuevos o precisión &lt; 80%, con validación del area de sostenibilidad. Precision actual (datos simulados): N/D% | AUC-ROC: N/D.</w:t>
+        <w:t>El sistema incluye un modelo Random Forest para estimación preliminar de elegibilidad. Conforme a Riley et al. (2019), el primer entrenamiento con datos reales requiere mínimo 200 casos evaluados. Reentrenamiento cada 150 casos nuevos o precisión &lt; 80%, con validación del área de sostenibilidad. Precisión actual (datos simulados): N/D% | AUC-ROC: N/D.</w:t>
       </w:r>
     </w:p>
     <w:sectPr>

</xml_diff>